<commit_message>
Rework archaic words project without the street walk, add student data
The student's dictionary check is complete and now drives section 2.1;
media monitoring uses egemen.kz only. Status and hypothesis stay open
until all 36 words are monitored.

Co-Authored-By: Claude Opus 5.5 <noreply@anthropic.com>
Claude-Session: https://claude.ai/code/session_01GWp2V469ega9rMmDw4DHEN
</commit_message>
<xml_diff>
--- a/Zerde_Konergen_sozder/Etika_paragy.docx
+++ b/Zerde_Konergen_sozder/Etika_paragy.docx
@@ -367,7 +367,7 @@
                 <w:sz w:val="22"/>
                 <w:szCs w:val="22"/>
               </w:rPr>
-              <w:t xml:space="preserve">Тәуекелдер: тест қатысушыларының жеке мәліметі; көшеде жүру; суретке адамдардың түсіп қалуы</w:t>
+              <w:t xml:space="preserve">Негізгі тәуекел – тест қатысушыларының жеке мәліметі; тест анонимді жүргізілді</w:t>
             </w:r>
           </w:p>
         </w:tc>
@@ -508,7 +508,7 @@
                 <w:sz w:val="22"/>
                 <w:szCs w:val="22"/>
               </w:rPr>
-              <w:t xml:space="preserve">Ересектерден – өз келісімі, оқушылардан – ата-анасының жазбаша келісімі (В қосымшасы); қатысу ерікті</w:t>
+              <w:t xml:space="preserve">Ересектерден – өз келісімі, оқушылардан – ата-анасының жазбаша келісімі (Б қосымшасы); қатысу ерікті</w:t>
             </w:r>
           </w:p>
         </w:tc>
@@ -897,7 +897,7 @@
                 <w:sz w:val="22"/>
                 <w:szCs w:val="22"/>
               </w:rPr>
-              <w:t xml:space="preserve">☒ Иә   ☐ Қолданылмайды</w:t>
+              <w:t xml:space="preserve">☐ Иә   ☒ Қолданылмайды</w:t>
             </w:r>
           </w:p>
         </w:tc>
@@ -931,7 +931,7 @@
                 <w:sz w:val="22"/>
                 <w:szCs w:val="22"/>
               </w:rPr>
-              <w:t xml:space="preserve">Лингвистикалық серуен ересек адамның қасында, күндіз, жаяу жүргіншілер жолымен жүргізілді</w:t>
+              <w:t xml:space="preserve">Мұндай тәуекелдер жоқ</w:t>
             </w:r>
           </w:p>
         </w:tc>
@@ -1213,7 +1213,7 @@
                 <w:sz w:val="22"/>
                 <w:szCs w:val="22"/>
               </w:rPr>
-              <w:t xml:space="preserve">Маңдайшалардың суреттерін автор өзі түсірді, суретте адамдардың беті мен көлік нөмірлері жоқ; БАҚ-тан алынған мысалдарға сілтеме берілді</w:t>
+              <w:t xml:space="preserve">БАҚ-тан алынған мысалдар мен сөздік анықтамаларына сілтеме берілді; суреттер мен диаграммаларды автор өзі жасады</w:t>
             </w:r>
           </w:p>
         </w:tc>
@@ -1354,7 +1354,7 @@
                 <w:sz w:val="22"/>
                 <w:szCs w:val="22"/>
               </w:rPr>
-              <w:t xml:space="preserve">Зерттеу күнделігі; зерттеу кестесі (Zertteu_kestesi.xlsx); серуен суреттері</w:t>
+              <w:t xml:space="preserve">Зерттеу күнделігі; зерттеу кестесі (Zertteu_kestesi.xlsx)</w:t>
             </w:r>
           </w:p>
         </w:tc>

</xml_diff>